<commit_message>
Fix probate modal (probate-only, no LA selector) + fix DOCX name overrun
- Simplified "Start Without Will" to always create probate type
- Removed LA type selector from modal (upload external will = probate)
- Fixed DOCX templates: reduced excessive tabs/spaces before …PEMOHON
- Added smart font size reduction for long names in signing pages
  (auto-shrinks to 10pt or 9pt when text would wrap to next line)

Co-Authored-By: Claude Opus 4.6 <noreply@anthropic.com>
</commit_message>
<xml_diff>
--- a/probate_templates/doc01_saman_pemula.docx
+++ b/probate_templates/doc01_saman_pemula.docx
@@ -496,13 +496,9 @@
           <w:sz w:val="22"/>
           <w:szCs w:val="22"/>
         </w:rPr>
-        <w:t xml:space="preserve">(No. K/P: {{APPLICANT_NRIC}})    </w:t>
+        <w:t>(No. K/P: {{APPLICANT_NRIC}})</w:t>
         <w:tab/>
-        <w:tab/>
-        <w:tab/>
-        <w:tab/>
-        <w:tab/>
-        <w:t xml:space="preserve">                   …PEMOHON  </w:t>
+        <w:t>…PEMOHON</w:t>
       </w:r>
       <w:r>
         <w:rPr>
@@ -2066,13 +2062,9 @@
           <w:sz w:val="22"/>
           <w:szCs w:val="22"/>
         </w:rPr>
-        <w:t xml:space="preserve">(No. K/P: {{APPLICANT_NRIC}})    </w:t>
+        <w:t>(No. K/P: {{APPLICANT_NRIC}})</w:t>
         <w:tab/>
-        <w:tab/>
-        <w:tab/>
-        <w:tab/>
-        <w:tab/>
-        <w:t xml:space="preserve">                   …PEMOHON  </w:t>
+        <w:t>…PEMOHON</w:t>
       </w:r>
       <w:r>
         <w:rPr>

</xml_diff>